<commit_message>
Revise LawnStarter cover letter wording and drop em dashes
Rewrote body copy per Josh's preferred phrasing, cleaned up a
copy-paste duplication artifact from the PDF round-trip, and removed
em dashes throughout per house style (commas/parentheses instead).
</commit_message>
<xml_diff>
--- a/applications/lawnstarter-senior-lifecycle-marketing-manager/cover-letter.docx
+++ b/applications/lawnstarter-senior-lifecycle-marketing-manager/cover-letter.docx
@@ -94,7 +94,7 @@
           <w:b w:val="0"/>
           <w:color w:val="1A1A1A"/>
         </w:rPr>
-        <w:t>I'm applying for the Senior Lifecycle Marketing Manager role because you describe the job the way I actually work: no agency, no contractor pool, you write the message, build it, send it, and read the results yourself. That's been my daily reality at Solenzo, the company I founded, for the past two and a half years.</w:t>
+        <w:t>I am excited to apply for the Senior Lifecycle Marketing Manager role at LawnStarter because the way you describe the job aligns closely with how I work: no agency, no contractor pool, you write the message, build it, send it, and analyze the results yourself. That has been my daily reality at Solenzo, the company I founded and have led for the past two and a half years.</w:t>
       </w:r>
     </w:p>
     <w:p>
@@ -107,7 +107,7 @@
           <w:b w:val="0"/>
           <w:color w:val="1A1A1A"/>
         </w:rPr>
-        <w:t>I've architected a complete lifecycle-automation system there - 20+ workflows spanning lead capture, qualification, triggered booking with confirmations and reminders, no-show recovery, onboarding nurture, and long-term reactivation - and I build every piece of it myself: the agent logic, the copy, the monitoring that catches a broken sequence before a customer notices. I break down manual marketing workflows into agent architectures that score a business's digital footprint and generate personalized outreach at a level of detail I couldn't produce by hand, which is the same problem you describe as the reason this role exists. I've never touched Braze specifically, but the discipline - segmentation, triggered logic, personalization, and the judgment to know what actually deserves automating - is the same skill regardless of platform, and I pick up new tools fast because every client relationship starts with learning their existing stack.</w:t>
+        <w:t>I have architected a comprehensive lifecycle automation system, over 20 workflows spanning lead capture, qualification, triggered booking with confirmations and reminders, no-show recovery, onboarding nurture, and long-term reactivation, and I built every piece of it myself: the agent logic, the copy, and the monitoring that detects and resolves issues before a customer even notices.</w:t>
       </w:r>
     </w:p>
     <w:p>
@@ -120,7 +120,33 @@
           <w:b w:val="0"/>
           <w:color w:val="1A1A1A"/>
         </w:rPr>
-        <w:t>I'd welcome the chance to walk through what I've built and what it did. Thank you for considering my application.</w:t>
+        <w:t>I break down manual marketing workflows into agent-driven architectures that score a business's digital footprint and generate personalized outreach at a level of detail impossible to achieve by hand, the same challenge you describe as the reason this role exists.</w:t>
+      </w:r>
+    </w:p>
+    <w:p>
+      <w:pPr>
+        <w:spacing w:after="160"/>
+      </w:pPr>
+      <w:r>
+        <w:rPr>
+          <w:rFonts w:ascii="Calibri" w:hAnsi="Calibri"/>
+          <w:b w:val="0"/>
+          <w:color w:val="1A1A1A"/>
+        </w:rPr>
+        <w:t>While I have not used Braze specifically, the discipline (segmentation, triggered logic, personalization, and the judgment to know what truly deserves automation) is the same skill regardless of platform. I quickly master new tools because every client relationship begins with learning their existing stack.</w:t>
+      </w:r>
+    </w:p>
+    <w:p>
+      <w:pPr>
+        <w:spacing w:after="160"/>
+      </w:pPr>
+      <w:r>
+        <w:rPr>
+          <w:rFonts w:ascii="Calibri" w:hAnsi="Calibri"/>
+          <w:b w:val="0"/>
+          <w:color w:val="1A1A1A"/>
+        </w:rPr>
+        <w:t>I would welcome the opportunity to discuss in detail what I have built and the impact it had. Thank you for considering my application.</w:t>
       </w:r>
     </w:p>
     <w:p>

</xml_diff>

<commit_message>
Refresh LawnStarter Sr Lifecycle Marketing Manager application package
- Add the Application-Form and Eligibility Check to the match report, flagging
  the Texas-vs-remote-US discrepancy in the posting as the item to resolve first
- Rename the score section to Application Priority Score and add per-dimension
  reasoning; separate genuine gaps from candidate-confirmation questions
- Rewrite the cover letter to three paragraphs, dropping the throat-clearing open
- Drop the awkward SMS-style/in-app-style hedges from the resume summary and
  record SMS as a profile question instead of implying it

Co-Authored-By: Claude Opus 5 <noreply@anthropic.com>
Claude-Session: https://claude.ai/code/session_01LrhEsVPRnqdqeeo1HQawtE
</commit_message>
<xml_diff>
--- a/applications/lawnstarter-senior-lifecycle-marketing-manager/cover-letter.docx
+++ b/applications/lawnstarter-senior-lifecycle-marketing-manager/cover-letter.docx
@@ -42,7 +42,7 @@
           <w:b w:val="0"/>
           <w:color w:val="1A1A1A"/>
         </w:rPr>
-        <w:t>August 23, 2026</w:t>
+        <w:t>August 28, 2026</w:t>
       </w:r>
     </w:p>
     <w:p>
@@ -94,7 +94,7 @@
           <w:b w:val="0"/>
           <w:color w:val="1A1A1A"/>
         </w:rPr>
-        <w:t>I am excited to apply for the Senior Lifecycle Marketing Manager role at LawnStarter because the way you describe the job aligns closely with how I work: no agency, no contractor pool, you write the message, build it, send it, and analyze the results yourself. That has been my daily reality at Solenzo, the company I founded and have led for the past two and a half years.</w:t>
+        <w:t>You are hiring someone to write the message, build it, send it, and read the result, with nobody in between. That is how I have worked for the past two and a half years at Solenzo, the marketing systems company I founded and run, and it is why this posting reads differently to me than most lifecycle roles do.</w:t>
       </w:r>
     </w:p>
     <w:p>
@@ -107,7 +107,7 @@
           <w:b w:val="0"/>
           <w:color w:val="1A1A1A"/>
         </w:rPr>
-        <w:t>I have architected a comprehensive lifecycle automation system, over 20 workflows spanning lead capture, qualification, triggered booking with confirmations and reminders, no-show recovery, onboarding nurture, and long-term reactivation, and I built every piece of it myself: the agent logic, the copy, and the monitoring that detects and resolves issues before a customer even notices.</w:t>
+        <w:t>What I built there is a lifecycle program in miniature: 20+ workflows covering lead capture and routing, qualification, booking with confirmation and reminders, no-show recovery, post-sale onboarding nurture, long-term reactivation, and review generation. I wrote every message in it. On top of that sits the layer your posting calls the single biggest reason the role exists, agent logic that scores a business's digital footprint and generates outreach personalized at a grain I could not produce by hand, running through an audit workflow that enrolled 180+ contacts. Around all of it I built evaluation loops that watch the agents' output and surface a broken or underperforming path before anyone downstream notices it.</w:t>
       </w:r>
     </w:p>
     <w:p>
@@ -120,33 +120,7 @@
           <w:b w:val="0"/>
           <w:color w:val="1A1A1A"/>
         </w:rPr>
-        <w:t>I break down manual marketing workflows into agent-driven architectures that score a business's digital footprint and generate personalized outreach at a level of detail impossible to achieve by hand, the same challenge you describe as the reason this role exists.</w:t>
-      </w:r>
-    </w:p>
-    <w:p>
-      <w:pPr>
-        <w:spacing w:after="160"/>
-      </w:pPr>
-      <w:r>
-        <w:rPr>
-          <w:rFonts w:ascii="Calibri" w:hAnsi="Calibri"/>
-          <w:b w:val="0"/>
-          <w:color w:val="1A1A1A"/>
-        </w:rPr>
-        <w:t>While I have not used Braze specifically, the discipline (segmentation, triggered logic, personalization, and the judgment to know what truly deserves automation) is the same skill regardless of platform. I quickly master new tools because every client relationship begins with learning their existing stack.</w:t>
-      </w:r>
-    </w:p>
-    <w:p>
-      <w:pPr>
-        <w:spacing w:after="160"/>
-      </w:pPr>
-      <w:r>
-        <w:rPr>
-          <w:rFonts w:ascii="Calibri" w:hAnsi="Calibri"/>
-          <w:b w:val="0"/>
-          <w:color w:val="1A1A1A"/>
-        </w:rPr>
-        <w:t>I would welcome the opportunity to discuss in detail what I have built and the impact it had. Thank you for considering my application.</w:t>
+        <w:t>I have not worked in Braze. The discipline underneath it, segmentation, trigger logic, personalization, and the judgment about what deserves automation at all, is what I do daily, and learning a client's existing stack has been the first step of every engagement I have run. I would like to walk you through what I built, where it fails, and what it returned.</w:t>
       </w:r>
     </w:p>
     <w:p>

</xml_diff>